<commit_message>
Use names instead of gendered pronouns in earlier meeting summaries
Pronouns for team members and the client were not stated in the recordings, so
the five earlier summaries now use names or neutral wording. No change to the
recorded content.

Co-Authored-By: Claude <noreply@anthropic.com>
Claude-Session: https://claude.ai/code/session_0186jZNwditdKL13LW3reYgi
</commit_message>
<xml_diff>
--- a/MDPM 883/Milestone 2/Meeting Summaries/Client_Support_Call_Summary_2026-10-14.docx
+++ b/MDPM 883/Milestone 2/Meeting Summaries/Client_Support_Call_Summary_2026-10-14.docx
@@ -661,7 +661,7 @@
                 <w:sz w:val="19"/>
                 <w:szCs w:val="19"/>
               </w:rPr>
-              <w:t xml:space="preserve">Fuyang Xu: Warren said at the start that he was not there. Anne-Marie Lampow: no contribution appears in the transcript, so attendance cannot be confirmed.</w:t>
+              <w:t xml:space="preserve">Fuyang Xu: Warren said at the start that Fuyang was not there. Anne-Marie Lampow: no contribution appears in the transcript, so attendance cannot be confirmed.</w:t>
             </w:r>
           </w:p>
         </w:tc>
@@ -1030,7 +1030,7 @@
           <w:sz w:val="20"/>
           <w:szCs w:val="20"/>
         </w:rPr>
-        <w:t xml:space="preserve">Cohen had not seen the latest version. He advised building out the other paths in the same way as the furniture path and tidying them, because people get caught up on small things and this gives better feedback.</w:t>
+        <w:t xml:space="preserve">Cohen had not seen the latest version. Cohen advised building out the other paths in the same way as the furniture path and tidying them, because people get caught up on small things and this gives better feedback.</w:t>
       </w:r>
     </w:p>
     <w:p>
@@ -1064,7 +1064,7 @@
           <w:sz w:val="20"/>
           <w:szCs w:val="20"/>
         </w:rPr>
-        <w:t xml:space="preserve">Cohen sent the survey to about 120 people. Mmenyene had no responses as of the previous day; checking during the call, she found 18. More were expected, though some would be delayed by 48-hour notice periods.</w:t>
+        <w:t xml:space="preserve">Cohen sent the survey to about 120 people. Mmenyene had no responses as of the previous day; checking during the call, Mmenyene found 18. More were expected, though some would be delayed by 48-hour notice periods.</w:t>
       </w:r>
     </w:p>
     <w:p>
@@ -1100,25 +1100,25 @@
           <w:sz w:val="20"/>
           <w:szCs w:val="20"/>
         </w:rPr>
-        <w:t xml:space="preserve">Cohen asked the team to propose roughly one session per day on the days it wants and to send him the respondents who said yes. He will line up a participant for each session (for example an infrastructure staff member who actions requests, or a CMAC who submits them) and contact the respondents; the team is to put the sessions in his calendar.</w:t>
-      </w:r>
-    </w:p>
-    <w:p>
-      <w:pPr>
-        <w:pStyle w:val="ListParagraph"/>
-        <w:numPr>
-          <w:ilvl w:val="0"/>
-          <w:numId w:val="2"/>
-        </w:numPr>
-        <w:spacing w:after="40"/>
-      </w:pPr>
-      <w:r>
-        <w:rPr>
-          <w:rFonts w:ascii="Calibri" w:cs="Calibri" w:eastAsia="Calibri" w:hAnsi="Calibri"/>
-          <w:sz w:val="20"/>
-          <w:szCs w:val="20"/>
-        </w:rPr>
-        <w:t xml:space="preserve">There are 18 respondents plus a couple of CMAC contacts known to Cohen. If good participants run out, the team would speak with Cohen’s staff; he will say so in advance.</w:t>
+        <w:t xml:space="preserve">Cohen asked the team to propose roughly one session per day on the days it wants and to send the respondents who said yes. Cohen will line up a participant for each session (for example an infrastructure staff member who actions requests, or a CMAC who submits them) and contact the respondents; the team is to put the sessions in Cohen’s calendar.</w:t>
+      </w:r>
+    </w:p>
+    <w:p>
+      <w:pPr>
+        <w:pStyle w:val="ListParagraph"/>
+        <w:numPr>
+          <w:ilvl w:val="0"/>
+          <w:numId w:val="2"/>
+        </w:numPr>
+        <w:spacing w:after="40"/>
+      </w:pPr>
+      <w:r>
+        <w:rPr>
+          <w:rFonts w:ascii="Calibri" w:cs="Calibri" w:eastAsia="Calibri" w:hAnsi="Calibri"/>
+          <w:sz w:val="20"/>
+          <w:szCs w:val="20"/>
+        </w:rPr>
+        <w:t xml:space="preserve">There are 18 respondents plus a couple of CMAC contacts known to Cohen. If good participants run out, the team would speak with Cohen’s staff; Cohen will say so in advance.</w:t>
       </w:r>
     </w:p>
     <w:p>
@@ -1152,43 +1152,43 @@
           <w:sz w:val="20"/>
           <w:szCs w:val="20"/>
         </w:rPr>
-        <w:t xml:space="preserve">Use a scenario, even one bullet (such as “submit a furniture request”). Cohen cited a UAT he had joined that morning where testers were simply told to test the system.</w:t>
-      </w:r>
-    </w:p>
-    <w:p>
-      <w:pPr>
-        <w:pStyle w:val="ListParagraph"/>
-        <w:numPr>
-          <w:ilvl w:val="0"/>
-          <w:numId w:val="2"/>
-        </w:numPr>
-        <w:spacing w:after="40"/>
-      </w:pPr>
-      <w:r>
-        <w:rPr>
-          <w:rFonts w:ascii="Calibri" w:cs="Calibri" w:eastAsia="Calibri" w:hAnsi="Calibri"/>
-          <w:sz w:val="20"/>
-          <w:szCs w:val="20"/>
-        </w:rPr>
-        <w:t xml:space="preserve">Replying to Qiuchen, he said “pretend this is your normal job” leaves gaps; a concrete case works better (for example, a broken chair in a given room), with participants talking through how they would do it in the current system and whether the new flow fits.</w:t>
-      </w:r>
-    </w:p>
-    <w:p>
-      <w:pPr>
-        <w:pStyle w:val="ListParagraph"/>
-        <w:numPr>
-          <w:ilvl w:val="0"/>
-          <w:numId w:val="2"/>
-        </w:numPr>
-        <w:spacing w:after="40"/>
-      </w:pPr>
-      <w:r>
-        <w:rPr>
-          <w:rFonts w:ascii="Calibri" w:cs="Calibri" w:eastAsia="Calibri" w:hAnsi="Calibri"/>
-          <w:sz w:val="20"/>
-          <w:szCs w:val="20"/>
-        </w:rPr>
-        <w:t xml:space="preserve">He said coursework teaches an impartial, quiet approach, but a little back-and-forth helps participants; staying silent can make them standoffish. Acknowledging that the current system is disliked and that the team is helping replace it may help participants from more conservative ministries speak openly.</w:t>
+        <w:t xml:space="preserve">Use a scenario, even one bullet (such as “submit a furniture request”). Cohen cited a UAT Cohen had joined that morning where testers were simply told to test the system.</w:t>
+      </w:r>
+    </w:p>
+    <w:p>
+      <w:pPr>
+        <w:pStyle w:val="ListParagraph"/>
+        <w:numPr>
+          <w:ilvl w:val="0"/>
+          <w:numId w:val="2"/>
+        </w:numPr>
+        <w:spacing w:after="40"/>
+      </w:pPr>
+      <w:r>
+        <w:rPr>
+          <w:rFonts w:ascii="Calibri" w:cs="Calibri" w:eastAsia="Calibri" w:hAnsi="Calibri"/>
+          <w:sz w:val="20"/>
+          <w:szCs w:val="20"/>
+        </w:rPr>
+        <w:t xml:space="preserve">Replying to Qiuchen, Cohen said “pretend this is your normal job” leaves gaps; a concrete case works better (for example, a broken chair in a given room), with participants talking through how they would do it in the current system and whether the new flow fits.</w:t>
+      </w:r>
+    </w:p>
+    <w:p>
+      <w:pPr>
+        <w:pStyle w:val="ListParagraph"/>
+        <w:numPr>
+          <w:ilvl w:val="0"/>
+          <w:numId w:val="2"/>
+        </w:numPr>
+        <w:spacing w:after="40"/>
+      </w:pPr>
+      <w:r>
+        <w:rPr>
+          <w:rFonts w:ascii="Calibri" w:cs="Calibri" w:eastAsia="Calibri" w:hAnsi="Calibri"/>
+          <w:sz w:val="20"/>
+          <w:szCs w:val="20"/>
+        </w:rPr>
+        <w:t xml:space="preserve">Cohen said coursework teaches an impartial, quiet approach, but a little back-and-forth helps participants; staying silent can make them standoffish. Acknowledging that the current system is disliked and that the team is helping replace it may help participants from more conservative ministries speak openly.</w:t>
       </w:r>
     </w:p>
     <w:p>
@@ -1268,25 +1268,25 @@
           <w:sz w:val="20"/>
           <w:szCs w:val="20"/>
         </w:rPr>
-        <w:t xml:space="preserve">Cohen said the solution will live inside Prism Facilities (transcribed “Prison Facilities”), the application he is building to manage facilities in government buildings, and that integration is his to work out. He needs the workflow, independent of what it plugs into: assume supporting data (building information, supplies) exists and highlight where each step needs it.</w:t>
-      </w:r>
-    </w:p>
-    <w:p>
-      <w:pPr>
-        <w:pStyle w:val="ListParagraph"/>
-        <w:numPr>
-          <w:ilvl w:val="0"/>
-          <w:numId w:val="2"/>
-        </w:numPr>
-        <w:spacing w:after="40"/>
-      </w:pPr>
-      <w:r>
-        <w:rPr>
-          <w:rFonts w:ascii="Calibri" w:cs="Calibri" w:eastAsia="Calibri" w:hAnsi="Calibri"/>
-          <w:sz w:val="20"/>
-          <w:szCs w:val="20"/>
-        </w:rPr>
-        <w:t xml:space="preserve">He outlined the wider Prism structure: a role-based flow from facility evaluation through contractor, engineer review and manager approval, with facility coordinators, strategic planners and maintenance engineers handling scheduled, large-scale work. The team’s piece is ad hoc small requests (such as changing lights or furniture when something breaks), which he expects to appear as a work-order list for facility coordinators. Some functions (evaluation and TPM contractors) are moving to an external-facing service, so the work may later split into staff-facing and external-facing parts, still based on the team’s flows.</w:t>
+        <w:t xml:space="preserve">Cohen said the solution will live inside Prism Facilities (transcribed “Prison Facilities”), the application Cohen is building to manage facilities in government buildings, and that integration is Cohen’s to work out. Cohen needs the workflow, independent of what it plugs into: assume supporting data (building information, supplies) exists and highlight where each step needs it.</w:t>
+      </w:r>
+    </w:p>
+    <w:p>
+      <w:pPr>
+        <w:pStyle w:val="ListParagraph"/>
+        <w:numPr>
+          <w:ilvl w:val="0"/>
+          <w:numId w:val="2"/>
+        </w:numPr>
+        <w:spacing w:after="40"/>
+      </w:pPr>
+      <w:r>
+        <w:rPr>
+          <w:rFonts w:ascii="Calibri" w:cs="Calibri" w:eastAsia="Calibri" w:hAnsi="Calibri"/>
+          <w:sz w:val="20"/>
+          <w:szCs w:val="20"/>
+        </w:rPr>
+        <w:t xml:space="preserve">Cohen outlined the wider Prism structure: a role-based flow from facility evaluation through contractor, engineer review and manager approval, with facility coordinators, strategic planners and maintenance engineers handling scheduled, large-scale work. The team’s piece is ad hoc small requests (such as changing lights or furniture when something breaks), which is expected to appear as a work-order list for facility coordinators. Some functions (evaluation and TPM contractors) are moving to an external-facing service, so the work may later split into staff-facing and external-facing parts, still based on the team’s flows.</w:t>
       </w:r>
     </w:p>
     <w:p>
@@ -1320,25 +1320,25 @@
           <w:sz w:val="20"/>
           <w:szCs w:val="20"/>
         </w:rPr>
-        <w:t xml:space="preserve">Asked whether, after testing, a refined flow with a simple view of the information each step needs would help, Cohen said yes: a clickable prototype plus a write-up of how it works lets him replicate it in Prism, which he said he can do readily with AI tools; his team would then integrate it.</w:t>
-      </w:r>
-    </w:p>
-    <w:p>
-      <w:pPr>
-        <w:pStyle w:val="ListParagraph"/>
-        <w:numPr>
-          <w:ilvl w:val="0"/>
-          <w:numId w:val="2"/>
-        </w:numPr>
-        <w:spacing w:after="40"/>
-      </w:pPr>
-      <w:r>
-        <w:rPr>
-          <w:rFonts w:ascii="Calibri" w:cs="Calibri" w:eastAsia="Calibri" w:hAnsi="Calibri"/>
-          <w:sz w:val="20"/>
-          <w:szCs w:val="20"/>
-        </w:rPr>
-        <w:t xml:space="preserve">Asked whether the furniture flow could become a reusable service pattern, Cohen said one already exists: an application-submitter component on the design system (136 pages) that builds requests step by step and explains why each step is asked. He cited Government of Canada GC Forms as a comparable service and said configurable pick lists, and the ability to swap or reconfigure steps over time, would interest his team.</w:t>
+        <w:t xml:space="preserve">Asked whether, after testing, a refined flow with a simple view of the information each step needs would help, Cohen said yes: a clickable prototype plus a write-up of how it works lets Cohen replicate it in Prism, which Cohen said can be done readily with AI tools; Cohen’s team would then integrate it.</w:t>
+      </w:r>
+    </w:p>
+    <w:p>
+      <w:pPr>
+        <w:pStyle w:val="ListParagraph"/>
+        <w:numPr>
+          <w:ilvl w:val="0"/>
+          <w:numId w:val="2"/>
+        </w:numPr>
+        <w:spacing w:after="40"/>
+      </w:pPr>
+      <w:r>
+        <w:rPr>
+          <w:rFonts w:ascii="Calibri" w:cs="Calibri" w:eastAsia="Calibri" w:hAnsi="Calibri"/>
+          <w:sz w:val="20"/>
+          <w:szCs w:val="20"/>
+        </w:rPr>
+        <w:t xml:space="preserve">Asked whether the furniture flow could become a reusable service pattern, Cohen said one already exists: an application-submitter component on the design system (136 pages) that builds requests step by step and explains why each step is asked. Cohen cited Government of Canada GC Forms as a comparable service and said configurable pick lists, and the ability to swap or reconfigure steps over time, would interest Cohen’s team.</w:t>
       </w:r>
     </w:p>
     <w:p>
@@ -1390,7 +1390,7 @@
           <w:sz w:val="20"/>
           <w:szCs w:val="20"/>
         </w:rPr>
-        <w:t xml:space="preserve">He described four parties: the person who needs the furniture change and emails the shared inbox; the CMAC who manages the shared inbox and moves the request into the work-order system (transcribed “Warts” / “wards”); the infrastructure staff member who actions it; and the vendor who delivers and closes it. Knowing this process helps identify low-hanging fruit and the MVP.</w:t>
+        <w:t xml:space="preserve">Cohen described four parties: the person who needs the furniture change and emails the shared inbox; the CMAC who manages the shared inbox and moves the request into the work-order system (transcribed “Warts” / “wards”); the infrastructure staff member who actions it; and the vendor who delivers and closes it. Knowing this process helps identify low-hanging fruit and the MVP.</w:t>
       </w:r>
     </w:p>
     <w:p>
@@ -1462,7 +1462,7 @@
           <w:sz w:val="20"/>
           <w:szCs w:val="20"/>
         </w:rPr>
-        <w:t xml:space="preserve">Cohen said he did not know whether the team is empowered to define project scope or whether it evolves through discovery, and referred to a plan from the first phase; the sentence was not completed and no answer was recorded.</w:t>
+        <w:t xml:space="preserve">Cohen said it was unclear whether the team is empowered to define project scope or whether it evolves through discovery, and referred to a plan from the first phase; the sentence was not completed and no answer was recorded.</w:t>
       </w:r>
     </w:p>
     <w:p>
@@ -1496,25 +1496,25 @@
           <w:sz w:val="20"/>
           <w:szCs w:val="20"/>
         </w:rPr>
-        <w:t xml:space="preserve">Warren said the prototype the team will send is the Figma version, which differs from the clickable version on screen (Mmenyene said it lacks, notably, the checklist), because the course does not allow AI use for the Figma prototype. Cohen said people like the checklist and that he would speak to Kathryn (course instructor) the next day; no commitment followed.</w:t>
-      </w:r>
-    </w:p>
-    <w:p>
-      <w:pPr>
-        <w:pStyle w:val="ListParagraph"/>
-        <w:numPr>
-          <w:ilvl w:val="0"/>
-          <w:numId w:val="2"/>
-        </w:numPr>
-        <w:spacing w:after="40"/>
-      </w:pPr>
-      <w:r>
-        <w:rPr>
-          <w:rFonts w:ascii="Calibri" w:cs="Calibri" w:eastAsia="Calibri" w:hAnsi="Calibri"/>
-          <w:sz w:val="20"/>
-          <w:szCs w:val="20"/>
-        </w:rPr>
-        <w:t xml:space="preserve">In passing, Cohen said the interface on screen had small text and navigation that needs work. It is not clear from the transcript whether this referred to his own application or the team’s prototype.</w:t>
+        <w:t xml:space="preserve">Warren said the prototype the team will send is the Figma version, which differs from the clickable version on screen (Mmenyene said it lacks, notably, the checklist), because the course does not allow AI use for the Figma prototype. Cohen said people like the checklist and that Cohen would speak to Kathryn (course instructor) the next day; no commitment followed.</w:t>
+      </w:r>
+    </w:p>
+    <w:p>
+      <w:pPr>
+        <w:pStyle w:val="ListParagraph"/>
+        <w:numPr>
+          <w:ilvl w:val="0"/>
+          <w:numId w:val="2"/>
+        </w:numPr>
+        <w:spacing w:after="40"/>
+      </w:pPr>
+      <w:r>
+        <w:rPr>
+          <w:rFonts w:ascii="Calibri" w:cs="Calibri" w:eastAsia="Calibri" w:hAnsi="Calibri"/>
+          <w:sz w:val="20"/>
+          <w:szCs w:val="20"/>
+        </w:rPr>
+        <w:t xml:space="preserve">In passing, Cohen said the interface on screen had small text and navigation that needs work. It is not clear from the transcript whether this referred to Cohen’s own application or the team’s prototype.</w:t>
       </w:r>
     </w:p>
     <w:p>
@@ -3006,7 +3006,7 @@
           <w:sz w:val="20"/>
           <w:szCs w:val="20"/>
         </w:rPr>
-        <w:t xml:space="preserve">Whether Cohen’s remarks on small text and navigation referred to his application or the team’s prototype.</w:t>
+        <w:t xml:space="preserve">Whether Cohen’s remarks on small text and navigation referred to Cohen’s application or the team’s prototype.</w:t>
       </w:r>
     </w:p>
     <w:p>
@@ -3042,7 +3042,7 @@
           <w:sz w:val="20"/>
           <w:szCs w:val="20"/>
         </w:rPr>
-        <w:t xml:space="preserve">Figma version versus the clickable version with a checklist: Cohen said he would speak to Kathryn; no outcome.</w:t>
+        <w:t xml:space="preserve">Figma version versus the clickable version with a checklist: Cohen said a conversation with Kathryn was planned; no outcome.</w:t>
       </w:r>
     </w:p>
     <w:p>

</xml_diff>